<commit_message>
Review pass + presentation plan (papers/pres.md)
Full review of the thesis: confirmed GOST bibliography (alphabetical, hanging indent,
arXiv/journal forms), OOXML-rendered formulas, GOST figure/table captions, consistent
locked numbers, and zero AI-cliché markers. Fixes:
- cite the previously-uncited [19] (MT-Bench) in §4.7 — now all 19 sources are referenced;
- shorten two wrapping comment lines in Listing Б.3.

Add papers/pres.md — a 13-slide defense plan (~10 min) mapped to the commission's
structure (title / comparison with other methods / what was done / results / conclusion),
with per-slide theses, figure references, timing, defense positions, and anticipated Q&A.

Co-Authored-By: Claude Opus 4.8 <noreply@anthropic.com>
</commit_message>
<xml_diff>
--- a/papers/Козин_newera.docx
+++ b/papers/Козин_newera.docx
@@ -21798,7 +21798,7 @@
           <w:sz w:val="28"/>
           <w:szCs w:val="28"/>
         </w:rPr>
-        <w:t xml:space="preserve">Результаты следует сопроводить обсуждением угроз валидности. Измерения скорости получены на одном графическом ускорителе; на другой аппаратуре или при пакетировании запросов абсолютные значения изменятся, хотя относительные сравнения методов устойчивее. Отдельные вендорные ядра CUDA не полностью детерминированы, поэтому первичной записью воспроизводимости служат манифест и список начальных значений, а малый числовой дрейф признаётся допустимым (приложение Г). Качество оценивается только по GSM8K: бенчмарки кода и диалога в текущем раннере не оцениваются по точному совпадению, поэтому выводы о качестве ограничены областью математических рассуждений.</w:t>
+        <w:t xml:space="preserve">Результаты следует сопроводить обсуждением угроз валидности. Измерения скорости получены на одном графическом ускорителе; на другой аппаратуре или при пакетировании запросов абсолютные значения изменятся, хотя относительные сравнения методов устойчивее. Отдельные вендорные ядра CUDA не полностью детерминированы, поэтому первичной записью воспроизводимости служат манифест и список начальных значений, а малый числовой дрейф признаётся допустимым (приложение Г). Качество оценивается только по GSM8K: бенчмарки кода и диалога (в том числе MT-Bench [19]) в текущем раннере не оцениваются по точному совпадению, поэтому выводы о качестве ограничены областью математических рассуждений.</w:t>
       </w:r>
     </w:p>
     <w:p>
@@ -24727,7 +24727,7 @@
           <w:sz w:val="22"/>
           <w:szCs w:val="22"/>
         </w:rPr>
-        <w:t xml:space="preserve">H = entropy(q_probs); K = self.K_prev          # признаки состояния</w:t>
+        <w:t xml:space="preserve">H = entropy(q_probs); K = self.K_prev      # признаки состояния</w:t>
       </w:r>
       <w:r>
         <w:rPr>
@@ -24775,7 +24775,7 @@
           <w:sz w:val="22"/>
           <w:szCs w:val="22"/>
         </w:rPr>
-        <w:t xml:space="preserve">    self._verify_block(...)                     # нечёткая верификация, T</w:t>
+        <w:t xml:space="preserve">    self._verify_block(...)            # нечёткая верификация</w:t>
       </w:r>
       <w:r>
         <w:rPr>
@@ -24807,7 +24807,7 @@
           <w:sz w:val="22"/>
           <w:szCs w:val="22"/>
         </w:rPr>
-        <w:t xml:space="preserve">    k = min(k + 1, self.policy.config.gamma_max) # продолжить черновик</w:t>
+        <w:t xml:space="preserve">    k = min(k + 1, self.policy.config.gamma_max)   # продолжить</w:t>
       </w:r>
       <w:r>
         <w:rPr>
@@ -24823,7 +24823,7 @@
           <w:sz w:val="22"/>
           <w:szCs w:val="22"/>
         </w:rPr>
-        <w:t xml:space="preserve">self.K_prev = kl_divergence(q_probs, p_probs)   # задержанное обновление K</w:t>
+        <w:t xml:space="preserve">self.K_prev = kl_divergence(q_probs, p_probs)  # задержка K</w:t>
       </w:r>
     </w:p>
     <w:p>

</xml_diff>